<commit_message>
Document article DOCX metadata standard
</commit_message>
<xml_diff>
--- a/docs/Tenorshare CMS 文章助手同事试用指南.docx
+++ b/docs/Tenorshare CMS 文章助手同事试用指南.docx
@@ -144,12 +144,82 @@
         <w:pStyle w:val="Heading1"/>
       </w:pPr>
       <w:r>
-        <w:t>第五步 上传一篇新文章</w:t>
+        <w:t>第五步 按标准准备文章 DOCX</w:t>
       </w:r>
     </w:p>
     <w:p>
       <w:r>
-        <w:t>新开 Codex 对话，上传一篇新稿。把正文图片放在文章中对应位置；如果某张 Guide 图片已经在 CMS 图库里，就在稿件对应位置写清准确文件名。不要把几篇不同语言的文章混在一次任务里。</w:t>
+        <w:t>每篇文章只放一个网站、一种语言、一篇完整正文。把下面的文章信息放在 DOCX 开头，随后再写正文。已有 Meta 请逐字填写；缺少的字段可留“待 AI 按本站规范核对”，不要猜 CMS 数字 ID 或把别的站点资料复制过来。</w:t>
+      </w:r>
+    </w:p>
+    <w:p>
+      <w:pPr>
+        <w:pStyle w:val="PromptLabel"/>
+      </w:pPr>
+      <w:r>
+        <w:rPr>
+          <w:b/>
+        </w:rPr>
+        <w:t>可直接复制到新稿开头的文章信息模板</w:t>
+      </w:r>
+    </w:p>
+    <w:p>
+      <w:pPr>
+        <w:pStyle w:val="PromptText"/>
+        <w:keepLines/>
+      </w:pPr>
+      <w:r>
+        <w:t>文章信息 / Meta</w:t>
+        <w:br/>
+        <w:t>网站网址或产品：</w:t>
+        <w:br/>
+        <w:t>语言：</w:t>
+        <w:br/>
+        <w:t>文章类型：</w:t>
+        <w:br/>
+        <w:t>页面主标题（H1 / subject）：</w:t>
+        <w:br/>
+        <w:t>SEO 标题（title）：</w:t>
+        <w:br/>
+        <w:t>Meta Description（description）：</w:t>
+        <w:br/>
+        <w:t>Meta Keywords（keywords）：</w:t>
+        <w:br/>
+        <w:t>SEO 核心关键词（seo_keywords）：</w:t>
+        <w:br/>
+        <w:t>期望文章 URL（如已有；没有则写待 AI 核对）：</w:t>
+        <w:br/>
+        <w:t>作者、文章分类、关联产品（如已指定）：</w:t>
+        <w:br/>
+        <w:t>相关文章 URL 或标题（如已指定）：</w:t>
+        <w:br/>
+        <w:t>主图或封面图（如已指定）：</w:t>
+        <w:br/>
+        <w:br/>
+        <w:t>正文：从这里开始放完整文章。</w:t>
+      </w:r>
+    </w:p>
+    <w:p>
+      <w:r>
+        <w:t>页面主标题和 SEO 标题是两个字段，不要混成一项。文章 URL 应符合本站已确认的路径规则；作者、分类、产品、模板、相关文章和模块的 CMS ID 由 AI 实时查询，不要求你填写数字。AI 不能把“待核对”原样写入 CMS；必填 Meta 缺失时，应从稿件与本站规范形成明确取值并在保存前校验，无法确定就说明缺哪项。</w:t>
+      </w:r>
+    </w:p>
+    <w:p>
+      <w:r>
+        <w:t>图片应嵌在正文实际出现的位置，主图要标明“主图”，每张图可附一句说明它展示什么。已有 CMS 图片，尤其 Guide 或产品步骤图，请在对应位置写准确文件名；没有准确名称时不要让 AI 猜。表格、FAQ、链接、下载区或 Buy Box 如在稿件中有要求，也要保留在实际位置；是否显示及 HTML 格式仍以本站已确认规范为准。</w:t>
+      </w:r>
+    </w:p>
+    <w:p>
+      <w:pPr>
+        <w:pStyle w:val="Heading1"/>
+      </w:pPr>
+      <w:r>
+        <w:t>第六步 上传一篇新文章</w:t>
+      </w:r>
+    </w:p>
+    <w:p>
+      <w:r>
+        <w:t>新开 Codex 对话，上传按上一步准备的新稿。不要把几篇不同语言的文章混在一次任务里。</w:t>
       </w:r>
     </w:p>
     <w:p>
@@ -187,7 +257,7 @@
     </w:p>
     <w:p>
       <w:r>
-        <w:t>成功回复必须包含：目标网站网址、CMS 页面 ID、文章 URL、草稿状态、保存请求与回读请求的 request_id、正文和图片的核对结果，并明确写“文章未生成、未发布”。只说“正在处理”“HTML 已准备好”不算完成。</w:t>
+        <w:t>成功回复必须包含：目标网站网址、CMS 页面 ID、文章 URL、草稿状态、保存请求与回读请求的 request_id、标题与 Meta、作者／分类／产品等关联字段、正文和图片的核对结果，并明确写“文章未生成、未发布”。只说“正在处理”“HTML 已准备好”不算完成。</w:t>
       </w:r>
     </w:p>
     <w:p>

</xml_diff>

<commit_message>
Clarify six-field article meta and site-specific categories
</commit_message>
<xml_diff>
--- a/docs/Tenorshare CMS 文章助手同事试用指南.docx
+++ b/docs/Tenorshare CMS 文章助手同事试用指南.docx
@@ -149,7 +149,7 @@
     </w:p>
     <w:p>
       <w:r>
-        <w:t>每篇文章只放一个网站、一种语言、一篇完整正文。把下面的文章信息放在 DOCX 开头，随后再写正文。已有 Meta 请逐字填写；缺少的字段可留“待 AI 按本站规范核对”，不要猜 CMS 数字 ID 或把别的站点资料复制过来。</w:t>
+        <w:t>每篇文章只放一个网站、一种语言、一篇完整正文；网站、语言、文章类型在发给 AI 的消息中说明。DOCX 开头的 Meta 只放下面六项，不混入作者、分类、产品或图片字段。已有 Meta 请逐字填写；缺少的字段可留“待 AI 按本站规范核对”。</w:t>
       </w:r>
     </w:p>
     <w:p>
@@ -160,7 +160,7 @@
         <w:rPr>
           <w:b/>
         </w:rPr>
-        <w:t>可直接复制到新稿开头的文章信息模板</w:t>
+        <w:t>可直接复制到新稿开头的 Meta 模板</w:t>
       </w:r>
     </w:p>
     <w:p>
@@ -169,44 +169,32 @@
         <w:keepLines/>
       </w:pPr>
       <w:r>
-        <w:t>文章信息 / Meta</w:t>
+        <w:t>文章 Meta</w:t>
         <w:br/>
-        <w:t>网站网址或产品：</w:t>
+        <w:t>H1：</w:t>
         <w:br/>
-        <w:t>语言：</w:t>
+        <w:t>Meta Title：</w:t>
         <w:br/>
-        <w:t>文章类型：</w:t>
+        <w:t>Meta Description：</w:t>
         <w:br/>
-        <w:t>页面主标题（H1 / subject）：</w:t>
+        <w:t>关键词：</w:t>
         <w:br/>
-        <w:t>SEO 标题（title）：</w:t>
+        <w:t>主要关键词：</w:t>
         <w:br/>
-        <w:t>Meta Description（description）：</w:t>
-        <w:br/>
-        <w:t>Meta Keywords（keywords）：</w:t>
-        <w:br/>
-        <w:t>SEO 核心关键词（seo_keywords）：</w:t>
-        <w:br/>
-        <w:t>期望文章 URL（如已有；没有则写待 AI 核对）：</w:t>
-        <w:br/>
-        <w:t>作者、文章分类、关联产品（如已指定）：</w:t>
-        <w:br/>
-        <w:t>相关文章 URL 或标题（如已指定）：</w:t>
-        <w:br/>
-        <w:t>主图或封面图（如已指定）：</w:t>
+        <w:t>URL：</w:t>
         <w:br/>
         <w:br/>
-        <w:t>正文：从这里开始放完整文章。</w:t>
+        <w:t>正文：从这里开始放完整文章，并把所有图片放在要出现的位置。</w:t>
       </w:r>
     </w:p>
     <w:p>
       <w:r>
-        <w:t>页面主标题和 SEO 标题是两个字段，不要混成一项。文章 URL 应符合本站已确认的路径规则；作者、分类、产品、模板、相关文章和模块的 CMS ID 由 AI 实时查询，不要求你填写数字。AI 不能把“待核对”原样写入 CMS；必填 Meta 缺失时，应从稿件与本站规范形成明确取值并在保存前校验，无法确定就说明缺哪项。</w:t>
+        <w:t>H1 和 Meta Title 是两个字段，不要混成一项。URL 应符合本站已确认的路径规则。每个网站自己的分类、作者、产品、模板和相关文章规则，由 AI 在首次建立本站规范时从 CMS 旧文章及列表中学习；上传时再实时核对 CMS 记录和 ID。你不用填数字，也不用替 AI 查分类。AI 不能把“待核对”原样写入 CMS；无法确定必填 Meta 或分类时应说明缺口，不得套用其他站点。</w:t>
       </w:r>
     </w:p>
     <w:p>
       <w:r>
-        <w:t>图片应嵌在正文实际出现的位置，主图要标明“主图”，每张图可附一句说明它展示什么。已有 CMS 图片，尤其 Guide 或产品步骤图，请在对应位置写准确文件名；没有准确名称时不要让 AI 猜。表格、FAQ、链接、下载区或 Buy Box 如在稿件中有要求，也要保留在实际位置；是否显示及 HTML 格式仍以本站已确认规范为准。</w:t>
+        <w:t>主图不用在 Meta 里另填一栏，直接嵌在文章中应出现的位置；其他图片也按正文顺序嵌入。AI 按本站旧文章判断哪些是主图，以及是否需要同步设置 CMS 封面字段，不能套用其他站点规则。已有 CMS 图片，尤其 Guide 或产品步骤图，请在对应位置写准确文件名；没有准确名称时不要让 AI 猜。表格、FAQ、链接、下载区或 Buy Box 如在稿件中有要求，也要保留在实际位置；是否显示及 HTML 格式仍以本站已确认规范为准。</w:t>
       </w:r>
     </w:p>
     <w:p>

</xml_diff>

<commit_message>
Document site-specific optional modules and video handling
</commit_message>
<xml_diff>
--- a/docs/Tenorshare CMS 文章助手同事试用指南.docx
+++ b/docs/Tenorshare CMS 文章助手同事试用指南.docx
@@ -93,7 +93,7 @@
     </w:p>
     <w:p>
       <w:r>
-        <w:t>首次为某个网站、语言和文章类型建规范，建议选较强的模型。AI 会读取该站点已经发布的同类文章，整理标题、目录、段落、图片、表格、FAQ、下载区和 Buy Box 等实际结构。旧 HTML 或参考 URL 可作为补充，但通常不需要你主动找。</w:t>
+        <w:t>首次为某个网站、语言和文章类型建规范，建议选较强的模型。AI 会读取该站点已经发布的同类文章，整理标题、目录、段落、图片、表格、下载区、使用指南、Buy Box、视频和本站其他模块的真实结构。它会标明哪些必有、可选、不存在或待确认，以及各自的出现条件和顺序；不会把 PoGoskill 的模块当作全站通用要求。旧 HTML 或参考 URL 可作为补充，但通常不需要你主动找。</w:t>
       </w:r>
     </w:p>
     <w:p>
@@ -113,7 +113,7 @@
         <w:keepLines/>
       </w:pPr>
       <w:r>
-        <w:t>我负责【网站网址或产品名】【语言】的【文章类型】。请使用 $tenorshare-cms-article-assistant，从 CMS 同站点已发布文章建立只供本站使用的 HTML 规范。给我看简明审核报告、真实组件样本和待确认项。现在只建规范，不上传文章。</w:t>
+        <w:t>我负责【网站网址或产品名】【语言】的【文章类型】。请使用 $tenorshare-cms-article-assistant，从 CMS 同站点已发布文章建立只供本站使用的 HTML 规范。逐项判断下载、使用指南、视频等模块在本站是否存在、何时出现；给我看简明审核报告、真实组件样本和待确认项。现在只建规范，不上传文章。</w:t>
       </w:r>
     </w:p>
     <w:p>
@@ -131,7 +131,7 @@
     </w:p>
     <w:p>
       <w:r>
-        <w:t>AI 会告诉你本机规范的完整保存路径，并展示 review-report.md。你只需看目标网站、语言、文章类型、参考文章，以及各模块的样式样本和待确认项，不用读完整 HTML。</w:t>
+        <w:t>AI 会告诉你本机规范的完整保存路径，并展示 review-report.md。你只需看目标网站、语言、文章类型、参考文章，以及各模块是必有、可选还是不存在、何时使用、样式样本和待确认项，不用读完整 HTML。例如本站没有下载区就应写“无”；若有视频，应写清放置位置和真实嵌入结构。</w:t>
       </w:r>
     </w:p>
     <w:p>
@@ -194,7 +194,7 @@
     </w:p>
     <w:p>
       <w:r>
-        <w:t>主图不用在 Meta 里另填一栏，直接嵌在文章中应出现的位置；其他图片也按正文顺序嵌入。AI 按本站旧文章判断哪些是主图，以及是否需要同步设置 CMS 封面字段，不能套用其他站点规则。已有 CMS 图片，尤其 Guide 或产品步骤图，请在对应位置写准确文件名；没有准确名称时不要让 AI 猜。表格、FAQ、链接、下载区或 Buy Box 如在稿件中有要求，也要保留在实际位置；是否显示及 HTML 格式仍以本站已确认规范为准。</w:t>
+        <w:t>主图不用在 Meta 里另填一栏，直接嵌在文章中应出现的位置；其他图片也按正文顺序嵌入。AI 按本站旧文章判断哪些是主图，以及是否需要同步设置 CMS 封面字段，不能套用其他站点规则。已有 CMS 图片，尤其 Guide 或产品步骤图，请在对应位置写准确文件名；没有准确名称时不要让 AI 猜。表格、FAQ、链接、下载区、使用指南、Buy Box 或视频如在稿件中有要求，也要放在正文对应位置；视频请给实际素材或链接。AI 只按本站已确认规范处理：没有的模块不添加，出现了但规范未定义的特殊模块先请你确认，不会自行设计或漏掉后上传。</w:t>
       </w:r>
     </w:p>
     <w:p>

</xml_diff>